<commit_message>
Fill internship resumes with relevant experience
</commit_message>
<xml_diff>
--- a/resumes/ai/Ching-Wei-Kang-AI-Resume.docx
+++ b/resumes/ai/Ching-Wei-Kang-AI-Resume.docx
@@ -665,6 +665,101 @@
     <w:p>
       <w:pPr>
         <w:keepNext/>
+        <w:tabs>
+          <w:tab w:pos="10858" w:val="right"/>
+        </w:tabs>
+        <w:spacing w:before="12" w:after="0"/>
+      </w:pPr>
+      <w:r>
+        <w:rPr>
+          <w:rFonts w:ascii="Arial" w:hAnsi="Arial"/>
+          <w:b/>
+          <w:color w:val="000000"/>
+          <w:sz w:val="19"/>
+        </w:rPr>
+        <w:t>China Association for Science and Technology (CAST)</w:t>
+      </w:r>
+      <w:r>
+        <w:tab/>
+      </w:r>
+      <w:r>
+        <w:rPr>
+          <w:rFonts w:ascii="Arial" w:hAnsi="Arial"/>
+          <w:b/>
+          <w:i w:val="0"/>
+          <w:color w:val="000000"/>
+          <w:sz w:val="19"/>
+        </w:rPr>
+        <w:t>United States | Remote</w:t>
+      </w:r>
+    </w:p>
+    <w:p>
+      <w:pPr>
+        <w:keepNext/>
+        <w:tabs>
+          <w:tab w:pos="10858" w:val="right"/>
+        </w:tabs>
+        <w:spacing w:before="0" w:after="0"/>
+      </w:pPr>
+      <w:r>
+        <w:rPr>
+          <w:rFonts w:ascii="Arial" w:hAnsi="Arial"/>
+          <w:b/>
+          <w:color w:val="000000"/>
+          <w:sz w:val="18"/>
+        </w:rPr>
+        <w:t>Research Assistant</w:t>
+      </w:r>
+      <w:r>
+        <w:tab/>
+      </w:r>
+      <w:r>
+        <w:rPr>
+          <w:rFonts w:ascii="Arial" w:hAnsi="Arial"/>
+          <w:b w:val="0"/>
+          <w:i/>
+          <w:color w:val="000000"/>
+          <w:sz w:val="18"/>
+        </w:rPr>
+        <w:t>Dec 2024 - Feb 2025</w:t>
+      </w:r>
+    </w:p>
+    <w:p>
+      <w:pPr>
+        <w:keepLines/>
+        <w:spacing w:after="11" w:line="240" w:lineRule="auto"/>
+        <w:ind w:left="259" w:hanging="173"/>
+      </w:pPr>
+      <w:r>
+        <w:rPr>
+          <w:rFonts w:ascii="Arial" w:hAnsi="Arial"/>
+          <w:b/>
+          <w:color w:val="000000"/>
+          <w:sz w:val="18"/>
+        </w:rPr>
+        <w:t xml:space="preserve">•  </w:t>
+      </w:r>
+      <w:r>
+        <w:rPr>
+          <w:rFonts w:ascii="Arial" w:hAnsi="Arial"/>
+          <w:b/>
+          <w:color w:val="000000"/>
+          <w:sz w:val="18"/>
+        </w:rPr>
+        <w:t>Built a Python forecasting model</w:t>
+      </w:r>
+      <w:r>
+        <w:rPr>
+          <w:rFonts w:ascii="Arial" w:hAnsi="Arial"/>
+          <w:color w:val="000000"/>
+          <w:sz w:val="18"/>
+        </w:rPr>
+        <w:t xml:space="preserve"> and multi-source analysis workflow to study AI talent allocation, document assumptions, reconcile institutional evidence, and deliver reproducible findings for national research stakeholders.</w:t>
+      </w:r>
+    </w:p>
+    <w:p>
+      <w:pPr>
+        <w:keepNext/>
         <w:spacing w:before="60" w:after="20"/>
         <w:pBdr>
           <w:bottom w:val="single" w:sz="10" w:space="1" w:color="000000"/>
@@ -1027,6 +1122,143 @@
     <w:p>
       <w:pPr>
         <w:keepNext/>
+        <w:tabs>
+          <w:tab w:pos="10858" w:val="right"/>
+        </w:tabs>
+        <w:spacing w:before="9" w:after="0"/>
+      </w:pPr>
+      <w:r>
+        <w:rPr>
+          <w:rFonts w:ascii="Arial" w:hAnsi="Arial"/>
+          <w:b/>
+          <w:color w:val="000000"/>
+          <w:sz w:val="18"/>
+        </w:rPr>
+        <w:t>TableUs - AI Group Recommendation</w:t>
+      </w:r>
+      <w:r>
+        <w:tab/>
+      </w:r>
+      <w:r>
+        <w:rPr>
+          <w:rFonts w:ascii="Arial" w:hAnsi="Arial"/>
+          <w:b/>
+          <w:i w:val="0"/>
+          <w:color w:val="000000"/>
+          <w:sz w:val="18"/>
+        </w:rPr>
+        <w:t>2026</w:t>
+      </w:r>
+    </w:p>
+    <w:p>
+      <w:pPr>
+        <w:spacing w:after="9"/>
+      </w:pPr>
+      <w:r>
+        <w:rPr>
+          <w:rFonts w:ascii="Arial" w:hAnsi="Arial"/>
+          <w:b/>
+          <w:color w:val="000000"/>
+          <w:sz w:val="18"/>
+        </w:rPr>
+        <w:t xml:space="preserve">Technologies: </w:t>
+      </w:r>
+      <w:r>
+        <w:rPr>
+          <w:rFonts w:ascii="Arial" w:hAnsi="Arial"/>
+          <w:color w:val="000000"/>
+          <w:sz w:val="18"/>
+        </w:rPr>
+        <w:t>Python, FastAPI, Gemini API, Google Maps API, preference modeling</w:t>
+      </w:r>
+    </w:p>
+    <w:p>
+      <w:pPr>
+        <w:keepLines/>
+        <w:spacing w:after="11" w:line="240" w:lineRule="auto"/>
+        <w:ind w:left="259" w:hanging="173"/>
+      </w:pPr>
+      <w:r>
+        <w:rPr>
+          <w:rFonts w:ascii="Arial" w:hAnsi="Arial"/>
+          <w:b/>
+          <w:color w:val="000000"/>
+          <w:sz w:val="18"/>
+        </w:rPr>
+        <w:t xml:space="preserve">•  </w:t>
+      </w:r>
+      <w:r>
+        <w:rPr>
+          <w:rFonts w:ascii="Arial" w:hAnsi="Arial"/>
+          <w:b/>
+          <w:color w:val="000000"/>
+          <w:sz w:val="18"/>
+        </w:rPr>
+        <w:t>Combined group preferences, geospatial context, and natural-language input</w:t>
+      </w:r>
+      <w:r>
+        <w:rPr>
+          <w:rFonts w:ascii="Arial" w:hAnsi="Arial"/>
+          <w:color w:val="000000"/>
+          <w:sz w:val="18"/>
+        </w:rPr>
+        <w:t xml:space="preserve"> into explainable recommendations; earned Second Place at the 2026 Cursor Hackathon.</w:t>
+      </w:r>
+    </w:p>
+    <w:p>
+      <w:pPr>
+        <w:keepNext/>
+        <w:spacing w:before="60" w:after="20"/>
+        <w:pBdr>
+          <w:bottom w:val="single" w:sz="10" w:space="1" w:color="000000"/>
+        </w:pBdr>
+      </w:pPr>
+      <w:r>
+        <w:rPr>
+          <w:rFonts w:ascii="Arial" w:hAnsi="Arial"/>
+          <w:b/>
+          <w:color w:val="4472C4"/>
+          <w:sz w:val="21"/>
+        </w:rPr>
+        <w:t>OPEN SOURCE</w:t>
+      </w:r>
+    </w:p>
+    <w:p>
+      <w:pPr>
+        <w:keepLines/>
+        <w:spacing w:after="11" w:line="240" w:lineRule="auto"/>
+        <w:ind w:left="259" w:hanging="173"/>
+      </w:pPr>
+      <w:r>
+        <w:rPr>
+          <w:rFonts w:ascii="Arial" w:hAnsi="Arial"/>
+          <w:b/>
+          <w:color w:val="000000"/>
+          <w:sz w:val="18"/>
+        </w:rPr>
+        <w:t xml:space="preserve">•  </w:t>
+      </w:r>
+      <w:r>
+        <w:rPr>
+          <w:rFonts w:ascii="Arial" w:hAnsi="Arial"/>
+          <w:b/>
+          <w:color w:val="000000"/>
+          <w:sz w:val="18"/>
+        </w:rPr>
+        <w:t>Contributed 201 merged pull requests</w:t>
+      </w:r>
+      <w:r>
+        <w:rPr>
+          <w:rFonts w:ascii="Arial" w:hAnsi="Arial"/>
+          <w:color w:val="000000"/>
+          <w:sz w:val="18"/>
+        </w:rPr>
+        <w:t xml:space="preserve"> to external repositories through maintainer review and CI workflows, including GitHub Docs, Docker CLI, Microsoft APM, NVIDIA NemoClaw, Meta DotSlash, and Repomix.</w:t>
+      </w:r>
+    </w:p>
+    <w:p>
+      <w:pPr>
+        <w:keepNext/>
         <w:spacing w:before="60" w:after="20"/>
         <w:pBdr>
           <w:bottom w:val="single" w:sz="10" w:space="1" w:color="000000"/>

</xml_diff>

<commit_message>
Rewrite experience bullets around purpose and impact
</commit_message>
<xml_diff>
--- a/resumes/ai/Ching-Wei-Kang-AI-Resume.docx
+++ b/resumes/ai/Ching-Wei-Kang-AI-Resume.docx
@@ -465,7 +465,7 @@
           <w:color w:val="000000"/>
           <w:sz w:val="18"/>
         </w:rPr>
-        <w:t xml:space="preserve"> for an AI video generation platform, integrating Gemini model calls into FastAPI services backed by PostgreSQL and Redis for reliable multistage inference workflows with structured validation and failure recovery.</w:t>
+        <w:t xml:space="preserve"> to make an AI video generation platform production-ready, integrating Gemini inference with FastAPI, PostgreSQL, and Redis for validated multistage workflows with failure recovery.</w:t>
       </w:r>
     </w:p>
     <w:p>
@@ -490,7 +490,7 @@
           <w:color w:val="000000"/>
           <w:sz w:val="18"/>
         </w:rPr>
-        <w:t>Orchestrated parallel keyframe and video tasks</w:t>
+        <w:t>Reduced repeated model calls and improved inference visibility</w:t>
       </w:r>
       <w:r>
         <w:rPr>
@@ -498,7 +498,7 @@
           <w:color w:val="000000"/>
           <w:sz w:val="18"/>
         </w:rPr>
-        <w:t xml:space="preserve"> with cache-backed intermediate outputs, reducing repeated model calls while exposing real-time progress through SSE streaming, cache observability, and production debugging controls.</w:t>
+        <w:t xml:space="preserve"> by orchestrating parallel keyframe and video tasks with cached intermediates, SSE progress streaming, cache observability, and production debugging controls.</w:t>
       </w:r>
     </w:p>
     <w:p>
@@ -523,7 +523,7 @@
           <w:color w:val="000000"/>
           <w:sz w:val="18"/>
         </w:rPr>
-        <w:t>Partnered with the CEO and four departments</w:t>
+        <w:t>Aligned AI delivery</w:t>
       </w:r>
       <w:r>
         <w:rPr>
@@ -531,7 +531,7 @@
           <w:color w:val="000000"/>
           <w:sz w:val="18"/>
         </w:rPr>
-        <w:t xml:space="preserve"> to translate AI workflow needs into production features with RBAC, observability, validation, and CI/CD controls for repeatable releases, stakeholder review, and operational monitoring.</w:t>
+        <w:t xml:space="preserve"> with product and operational needs by partnering with the CEO and four departments, then implementing RBAC, validation, observability, and CI/CD controls for repeatable releases and stakeholder review.</w:t>
       </w:r>
     </w:p>
     <w:p>
@@ -618,7 +618,7 @@
           <w:color w:val="000000"/>
           <w:sz w:val="18"/>
         </w:rPr>
-        <w:t>Designed multi-agent research workflows</w:t>
+        <w:t>Made pharmaceutical market research traceable</w:t>
       </w:r>
       <w:r>
         <w:rPr>
@@ -626,7 +626,7 @@
           <w:color w:val="000000"/>
           <w:sz w:val="18"/>
         </w:rPr>
-        <w:t xml:space="preserve"> with evidence grading, human review checkpoints, and automated validation for traceable pharmaceutical market intelligence with source provenance, citation checks, and reproducible exports.</w:t>
+        <w:t xml:space="preserve"> by designing multi-agent workflows with evidence grading, human review checkpoints, source provenance, citation checks, and automated validation, enabling reproducible exports.</w:t>
       </w:r>
     </w:p>
     <w:p>
@@ -651,7 +651,7 @@
           <w:color w:val="000000"/>
           <w:sz w:val="18"/>
         </w:rPr>
-        <w:t>Developed searchable interfaces and structured exports</w:t>
+        <w:t>Enabled reviewers to verify AI-assisted findings</w:t>
       </w:r>
       <w:r>
         <w:rPr>
@@ -659,7 +659,7 @@
           <w:color w:val="000000"/>
           <w:sz w:val="18"/>
         </w:rPr>
-        <w:t xml:space="preserve"> with source IDs, retrieval dates, and citation checks so AI-assisted findings remained auditable and reviewable across legal evidence, company data, and partner-verification workflows.</w:t>
+        <w:t xml:space="preserve"> by developing searchable interfaces and structured exports with source IDs, retrieval dates, and citation checks across legal, company, and partner-verification evidence.</w:t>
       </w:r>
     </w:p>
     <w:p>
@@ -746,7 +746,7 @@
           <w:color w:val="000000"/>
           <w:sz w:val="18"/>
         </w:rPr>
-        <w:t>Built a Python forecasting model</w:t>
+        <w:t>Supported national research decisions on AI talent allocation</w:t>
       </w:r>
       <w:r>
         <w:rPr>
@@ -754,7 +754,7 @@
           <w:color w:val="000000"/>
           <w:sz w:val="18"/>
         </w:rPr>
-        <w:t xml:space="preserve"> and multi-source analysis workflow to study AI talent allocation, document assumptions, reconcile institutional evidence, and deliver reproducible findings for national research stakeholders.</w:t>
+        <w:t xml:space="preserve"> by reconciling institutional evidence in Python, documenting model assumptions, and delivering a reproducible forecasting workflow to project stakeholders.</w:t>
       </w:r>
     </w:p>
     <w:p>

</xml_diff>

<commit_message>
Fill resume pages with relevant experience
</commit_message>
<xml_diff>
--- a/resumes/ai/Ching-Wei-Kang-AI-Resume.docx
+++ b/resumes/ai/Ching-Wei-Kang-AI-Resume.docx
@@ -760,6 +760,101 @@
     <w:p>
       <w:pPr>
         <w:keepNext/>
+        <w:tabs>
+          <w:tab w:pos="10858" w:val="right"/>
+        </w:tabs>
+        <w:spacing w:before="12" w:after="0"/>
+      </w:pPr>
+      <w:r>
+        <w:rPr>
+          <w:rFonts w:ascii="Arial" w:hAnsi="Arial"/>
+          <w:b/>
+          <w:color w:val="000000"/>
+          <w:sz w:val="19"/>
+        </w:rPr>
+        <w:t>The Marcus Harris Foundation</w:t>
+      </w:r>
+      <w:r>
+        <w:tab/>
+      </w:r>
+      <w:r>
+        <w:rPr>
+          <w:rFonts w:ascii="Arial" w:hAnsi="Arial"/>
+          <w:b/>
+          <w:i w:val="0"/>
+          <w:color w:val="000000"/>
+          <w:sz w:val="19"/>
+        </w:rPr>
+        <w:t>Washington, DC</w:t>
+      </w:r>
+    </w:p>
+    <w:p>
+      <w:pPr>
+        <w:keepNext/>
+        <w:tabs>
+          <w:tab w:pos="10858" w:val="right"/>
+        </w:tabs>
+        <w:spacing w:before="0" w:after="0"/>
+      </w:pPr>
+      <w:r>
+        <w:rPr>
+          <w:rFonts w:ascii="Arial" w:hAnsi="Arial"/>
+          <w:b/>
+          <w:color w:val="000000"/>
+          <w:sz w:val="18"/>
+        </w:rPr>
+        <w:t>Data Engineering and Automation Intern</w:t>
+      </w:r>
+      <w:r>
+        <w:tab/>
+      </w:r>
+      <w:r>
+        <w:rPr>
+          <w:rFonts w:ascii="Arial" w:hAnsi="Arial"/>
+          <w:b w:val="0"/>
+          <w:i/>
+          <w:color w:val="000000"/>
+          <w:sz w:val="18"/>
+        </w:rPr>
+        <w:t>Sep 2024 - Dec 2024</w:t>
+      </w:r>
+    </w:p>
+    <w:p>
+      <w:pPr>
+        <w:keepLines/>
+        <w:spacing w:after="11" w:line="240" w:lineRule="auto"/>
+        <w:ind w:left="259" w:hanging="173"/>
+      </w:pPr>
+      <w:r>
+        <w:rPr>
+          <w:rFonts w:ascii="Arial" w:hAnsi="Arial"/>
+          <w:b/>
+          <w:color w:val="000000"/>
+          <w:sz w:val="18"/>
+        </w:rPr>
+        <w:t xml:space="preserve">•  </w:t>
+      </w:r>
+      <w:r>
+        <w:rPr>
+          <w:rFonts w:ascii="Arial" w:hAnsi="Arial"/>
+          <w:b/>
+          <w:color w:val="000000"/>
+          <w:sz w:val="18"/>
+        </w:rPr>
+        <w:t>Made public nonprofit records analysis-ready</w:t>
+      </w:r>
+      <w:r>
+        <w:rPr>
+          <w:rFonts w:ascii="Arial" w:hAnsi="Arial"/>
+          <w:color w:val="000000"/>
+          <w:sz w:val="18"/>
+        </w:rPr>
+        <w:t xml:space="preserve"> by building a Python ingestion pipeline with reusable parsers, schema validation, and auditable source fields, then loading 50,000+ PostgreSQL records with 98% accuracy.</w:t>
+      </w:r>
+    </w:p>
+    <w:p>
+      <w:pPr>
+        <w:keepNext/>
         <w:spacing w:before="60" w:after="20"/>
         <w:pBdr>
           <w:bottom w:val="single" w:sz="10" w:space="1" w:color="000000"/>

</xml_diff>